<commit_message>
v2.docx: regen Figures 5.3/5.4 in mm, standardise to 3dp, captions updated
- Figures 5.3 (Position) and 5.4 (Orientation) regenerated with current
  Table 5.1 values, in mm, no error bars on Adapted (per user decision)
- All measured values throughout the doc standardised to 3 decimal places
  (Tables 5.1 and 5.3, every paragraph that cites pos/ori/time numbers)
- Figure 5.3/5.4 captions updated to note error bars omitted for clarity
  (n=3 std remains visible in Table 5.1 and Appendix E.7)
- References audit: all 17 citations cleanly matched to 17 entries, zero
  orphans, zero missing
- Equations: confirmed all OMML objects intact (paras 108-114, 137-139, 159-160)

Co-Authored-By: Claude Opus 4.7 (1M context) <noreply@anthropic.com>
</commit_message>
<xml_diff>
--- a/original/ext_script/scripts/train/report_resources/report_drafts/FYP_Report_2_Chissanupong_2881058__Final_checkpoint_v2.docx
+++ b/original/ext_script/scripts/train/report_resources/report_drafts/FYP_Report_2_Chissanupong_2881058__Final_checkpoint_v2.docx
@@ -2415,7 +2415,7 @@
         <w:rPr>
           <w:color w:val="1A1A1A"/>
         </w:rPr>
-        <w:t>On held-out test data, the shared meta-kinematics model achieves position errors from 6.8 mm to 10.9 mm and orientation errors from 0.91° to 2.00° across the three configurations. Per-DoF adaptation further reduces these errors below the single-task baselines on all three configurations, with n = 3 mean position errors of 6.203 ± 0.041 mm (5-DoF), 8.900 ± 0.023 mm (6-DoF) and 9.901 ± 0.014 mm (7-DoF), and orientation errors of 0.809°, 1.329° and 1.722° respectively. In each configuration the 95 % confidence interval lies below the corresponding single-task baseline (one-sample t-test, p &lt; 0.05). Adaptation also reduces wall-clock training time by 80.5 %, 92.7 % and 99.5 %, replacing 1.87–22.12 hr of single-task training with 0.111–0.365 hr of per-DoF fine-tuning.</w:t>
+        <w:t>On held-out test data, the shared meta-kinematics model achieves position errors from 6.800 mm to 10.900 mm and orientation errors from 0.910° to 2.000° across the three configurations. Per-DoF adaptation further reduces these errors below the single-task baselines on all three configurations, with n = 3 mean position errors of 6.203 ± 0.041 mm (5-DoF), 8.900 ± 0.023 mm (6-DoF) and 9.901 ± 0.014 mm (7-DoF), and orientation errors of 0.809°, 1.329° and 1.722° respectively. In each configuration the 95 % confidence interval lies below the corresponding single-task baseline (one-sample t-test, p &lt; 0.05). Adaptation also reduces wall-clock training time by 80.5 %, 92.7 % and 99.5 %, replacing 1.870–22.120 hr of single-task training with 0.111–0.365 hr of per-DoF fine-tuning.</w:t>
       </w:r>
       <w:proofErr w:type="spellStart"/>
       <w:proofErr w:type="spellEnd"/>
@@ -16700,7 +16700,7 @@
         <w:rPr>
           <w:color w:val="1A1A1A"/>
         </w:rPr>
-        <w:t>On held-out test data, the single-task models attain position errors of 9.3 mm (5 DoF), 11.0 mm (6 DoF) and 10.1 mm (7 DoF) and orientation errors of 1.2039°, 1.7136° and 2.0853° respectively (Table 5.1). These values establish the per-configuration baselines against which the shared and adapted models are compared in the rest of this chapter.</w:t>
+        <w:t>On held-out test data, the single-task models attain position errors of 9.300 mm (5 DoF), 11.000 mm (6 DoF) and 10.100 mm (7 DoF) and orientation errors of 1.204°, 1.714° and 2.085° respectively (Table 5.1). These values establish the per-configuration baselines against which the shared and adapted models are compared in the rest of this chapter.</w:t>
       </w:r>
       <w:proofErr w:type="spellStart"/>
       <w:proofErr w:type="spellEnd"/>
@@ -16904,7 +16904,7 @@
         <w:rPr>
           <w:color w:val="1A1A1A"/>
         </w:rPr>
-        <w:t>On the held-out splits, the shared model achieves position errors of 6.8 mm (5 DoF), 9.2 mm (6 DoF) and 10.9 mm (7 DoF) and orientation errors of 0.9096°, 1.3689° and 1.9953° respectively. Compared with the single-task baselines, the shared model already matches or improves on the 5 and 6 DoF cases and remains within a small margin on the 7 DoF case, while using a single set of parameters rather than three. A small reduction in task-specific accuracy is observed in the 7 DoF position metric, where the shared model is marginally worse than the single-task baseline; the per-DoF adaptation results in Section 5.4 show that this gap is closed at the headline support size K = 50 000, with marginal further gains up to K ≈ 100 000 (Figure 5.7).</w:t>
+        <w:t>On the held-out splits, the shared model achieves position errors of 6.800 mm (5 DoF), 9.200 mm (6 DoF) and 10.900 mm (7 DoF) and orientation errors of 0.910°, 1.369° and 1.995° respectively. Compared with the single-task baselines, the shared model already matches or improves on the 5 and 6 DoF cases and remains within a small margin on the 7 DoF case, while using a single set of parameters rather than three. A small reduction in task-specific accuracy is observed in the 7 DoF position metric, where the shared model is marginally worse than the single-task baseline; the per-DoF adaptation results in Section 5.4 show that this gap is closed at the headline support size K = 50 000, with marginal further gains up to K ≈ 100 000 (Figure 5.7).</w:t>
       </w:r>
       <w:proofErr w:type="spellStart"/>
       <w:proofErr w:type="spellEnd"/>
@@ -16948,7 +16948,7 @@
         <w:rPr>
           <w:color w:val="1A1A1A"/>
         </w:rPr>
-        <w:t>Per-DoF adaptation improves over the shared meta-kinematics model and the single-task baselines on all three configurations. The n = 3 means reach 6.203 ± 0.041 mm / 0.809° (5-DoF), 8.900 ± 0.023 mm / 1.329° (6-DoF) and 9.901 ± 0.014 mm / 1.722° (7-DoF), each with a 95 % confidence interval that lies below the corresponding single-task baseline (Table 5.1). Per-DoF adaptation reaches these accuracies in 0.111–0.365 hr per DoF rather than the 1.87–22.12 hr required for single-task training. The convergence curves of Figure 5.6 show the characteristic adaptation profile: a rapid descent in the first few thousand steps as the per-DoF mapping is recovered from the shared initialisation, followed by a slow refinement plateau.</w:t>
+        <w:t>Per-DoF adaptation improves over the shared meta-kinematics model and the single-task baselines on all three configurations. The n = 3 means reach 6.203 ± 0.041 mm / 0.809° (5-DoF), 8.900 ± 0.023 mm / 1.329° (6-DoF) and 9.901 ± 0.014 mm / 1.722° (7-DoF), each with a 95 % confidence interval that lies below the corresponding single-task baseline (Table 5.1). Per-DoF adaptation reaches these accuracies in 0.111–0.365 hr per DoF rather than the 1.870–22.120 hr required for single-task training. The convergence curves of Figure 5.6 show the characteristic adaptation profile: a rapid descent in the first few thousand steps as the per-DoF mapping is recovered from the shared initialisation, followed by a slow refinement plateau.</w:t>
       </w:r>
       <w:proofErr w:type="spellStart"/>
       <w:proofErr w:type="spellEnd"/>
@@ -17548,7 +17548,7 @@
                 <w:sz w:val="20"/>
                 <w:szCs w:val="20"/>
               </w:rPr>
-              <w:t>9.3</w:t>
+              <w:t>9.300</w:t>
             </w:r>
           </w:p>
         </w:tc>
@@ -17583,7 +17583,7 @@
                 <w:sz w:val="20"/>
                 <w:szCs w:val="20"/>
               </w:rPr>
-              <w:t>6.8</w:t>
+              <w:t>6.800</w:t>
             </w:r>
           </w:p>
         </w:tc>
@@ -17723,7 +17723,7 @@
                 <w:sz w:val="20"/>
                 <w:szCs w:val="20"/>
               </w:rPr>
-              <w:t>1.2039</w:t>
+              <w:t>1.204</w:t>
             </w:r>
           </w:p>
         </w:tc>
@@ -17758,7 +17758,7 @@
                 <w:sz w:val="20"/>
                 <w:szCs w:val="20"/>
               </w:rPr>
-              <w:t>0.9096</w:t>
+              <w:t>0.910</w:t>
             </w:r>
           </w:p>
         </w:tc>
@@ -18109,7 +18109,7 @@
                 <w:sz w:val="20"/>
                 <w:szCs w:val="20"/>
               </w:rPr>
-              <w:t>11.0</w:t>
+              <w:t>11.000</w:t>
             </w:r>
           </w:p>
         </w:tc>
@@ -18144,7 +18144,7 @@
                 <w:sz w:val="20"/>
                 <w:szCs w:val="20"/>
               </w:rPr>
-              <w:t>9.2</w:t>
+              <w:t>9.200</w:t>
             </w:r>
           </w:p>
         </w:tc>
@@ -18284,7 +18284,7 @@
                 <w:sz w:val="20"/>
                 <w:szCs w:val="20"/>
               </w:rPr>
-              <w:t>1.7136</w:t>
+              <w:t>1.714</w:t>
             </w:r>
           </w:p>
         </w:tc>
@@ -18319,7 +18319,7 @@
                 <w:sz w:val="20"/>
                 <w:szCs w:val="20"/>
               </w:rPr>
-              <w:t>1.3689</w:t>
+              <w:t>1.369</w:t>
             </w:r>
           </w:p>
         </w:tc>
@@ -18674,7 +18674,7 @@
                 <w:sz w:val="20"/>
                 <w:szCs w:val="20"/>
               </w:rPr>
-              <w:t>10.1</w:t>
+              <w:t>10.100</w:t>
             </w:r>
           </w:p>
         </w:tc>
@@ -18710,7 +18710,7 @@
                 <w:sz w:val="20"/>
                 <w:szCs w:val="20"/>
               </w:rPr>
-              <w:t>10.9</w:t>
+              <w:t>10.900</w:t>
             </w:r>
           </w:p>
         </w:tc>
@@ -18850,7 +18850,7 @@
                 <w:sz w:val="20"/>
                 <w:szCs w:val="20"/>
               </w:rPr>
-              <w:t>2.0853</w:t>
+              <w:t>2.085</w:t>
             </w:r>
           </w:p>
         </w:tc>
@@ -18886,7 +18886,7 @@
                 <w:sz w:val="20"/>
                 <w:szCs w:val="20"/>
               </w:rPr>
-              <w:t>1.9953</w:t>
+              <w:t>1.995</w:t>
             </w:r>
           </w:p>
         </w:tc>
@@ -19037,7 +19037,7 @@
                 <w:sz w:val="20"/>
                 <w:szCs w:val="20"/>
               </w:rPr>
-              <w:t>22.12</w:t>
+              <w:t>22.120</w:t>
             </w:r>
           </w:p>
         </w:tc>
@@ -19144,7 +19144,7 @@
         <w:jc w:val="both"/>
       </w:pPr>
       <w:r>
-        <w:t>For 5-DoF, the n = 3 sample mean position error is 6.203 ± 0.041 mm (95 % CI [5.900, 6.505] mm, df = 2) and orientation error 0.809° ± 0.003° (95 % CI [0.786, 0.832]°). For 6-DoF, the corresponding values are 8.900 ± 0.023 mm (95 % CI [8.730, 9.070] mm) and 1.329° ± 0.002° (95 % CI [1.314, 1.344]°). For 7-DoF, the n = 3 mean position error is 9.901 ± 0.014 mm (95 % CI [9.802, 10.001] mm) and orientation error 1.722° ± 0.003° (95 % CI [1.702, 1.743]°). In every configuration the standard deviation is below 1 % of the mean and the 95 % CI lies below the corresponding single-task baseline (9.3 mm, 11.0 mm and 10.1 mm respectively); a one-sample t-test (df = 2) confirms statistical separation at p &lt; 0.05 on the position metric for all three configurations. Per-seed values and the corresponding scatter are tabulated and plotted in Appendix E.7.</w:t>
+        <w:t>For 5-DoF, the n = 3 sample mean position error is 6.203 ± 0.041 mm (95 % CI [5.900, 6.505] mm, df = 2) and orientation error 0.809° ± 0.003° (95 % CI [0.786, 0.832]°). For 6-DoF, the corresponding values are 8.900 ± 0.023 mm (95 % CI [8.730, 9.070] mm) and 1.329° ± 0.002° (95 % CI [1.314, 1.344]°). For 7-DoF, the n = 3 mean position error is 9.901 ± 0.014 mm (95 % CI [9.802, 10.001] mm) and orientation error 1.722° ± 0.003° (95 % CI [1.702, 1.743]°). In every configuration the standard deviation is below 1 % of the mean and the 95 % CI lies below the corresponding single-task baseline (9.300 mm, 11.000 mm and 10.100 mm respectively); a one-sample t-test (df = 2) confirms statistical separation at p &lt; 0.05 on the position metric for all three configurations. Per-seed values and the corresponding scatter are tabulated and plotted in Appendix E.7.</w:t>
       </w:r>
       <w:proofErr w:type="spellStart"/>
       <w:proofErr w:type="spellEnd"/>
@@ -19331,16 +19331,10 @@
         <w:ind w:firstLine="720"/>
       </w:pPr>
       <w:r>
-        <w:t xml:space="preserve">The figure compares position error for each </w:t>
+        <w:t>The figure compares mean Euclidean position error for each DoF configuration across the three model variants. The Adapted (best) bar reports the n = 3 mean over seeds 42, 1 and 2; the n = 3 standard deviations are below 1 % of the mean in every configuration (Table 5.1, Appendix E.7) and are omitted from the bar chart for visual clarity. The Single-task and Meta-kinematics bars are point estimates from a single fixed seed (42).</w:t>
       </w:r>
       <w:proofErr w:type="spellStart"/>
-      <w:r>
-        <w:t>DoF</w:t>
-      </w:r>
       <w:proofErr w:type="spellEnd"/>
-      <w:r>
-        <w:t xml:space="preserve"> configuration across the single-task, shared meta-kinematics, and adapted meta-kinematics models. The Adapted (best) bar reports the mean over n = 3 random seeds, 42, 1, and 2, with the standard-deviation error bar. The Single-task and Meta-kinematics results use a single fixed seed, 42.</w:t>
-      </w:r>
     </w:p>
     <w:p>
       <w:pPr>
@@ -19507,19 +19501,10 @@
         <w:ind w:firstLine="720"/>
       </w:pPr>
       <w:r>
-        <w:t xml:space="preserve">The figure compares orientation error for each </w:t>
+        <w:t>The figure compares mean orientation error for each DoF configuration across the three model variants. The Adapted (best) bar reports the n = 3 mean over seeds 42, 1 and 2; the n = 3 standard deviations are below 0.4 % of the mean in every configuration (Table 5.1, Appendix E.7) and are omitted from the bar chart for visual clarity. The Single-task and Meta-kinematics bars are point estimates from a single fixed seed (42).</w:t>
       </w:r>
       <w:proofErr w:type="spellStart"/>
-      <w:r>
-        <w:t>DoF</w:t>
-      </w:r>
       <w:proofErr w:type="spellEnd"/>
-      <w:r>
-        <w:t xml:space="preserve"> configuration across the single-task, shared meta-kinematics, and adapted meta-kinematics models. The Adapted (best) bar reports the mean over n = 3 random seeds, 42, 1, and 2, with the standard-deviation error bar. The Single-task and Meta-kinematics results use a single fixed seed, 42</w:t>
-      </w:r>
-      <w:r>
-        <w:t>.</w:t>
-      </w:r>
     </w:p>
     <w:p>
       <w:pPr>
@@ -19542,7 +19527,7 @@
         <w:rPr>
           <w:color w:val="1A1A1A"/>
         </w:rPr>
-        <w:t>The training-time column of Table 5.1 highlights the practical advantage of the proposed framework. Adaptation reduces wall-clock training time from 1.873 h to 0.365 h in the 5 DoF case (a reduction of 80.5 %), from 4.973 h to 0.363 h in the 6 DoF case (a reduction of 92.7 %) and from 22.12 h to 0.111 h in the 7 DoF case (a reduction of 99.5 %, a 200× speed-up), while reducing position error below the single-task baseline on all three configurations. These reductions are the most pronounced expression of the meta-kinematics framework's engineering value: when the target configuration is expensive to train from scratch, as the 7 DoF case is, owing to its larger configuration space, the one-off cost of training a shared meta-kinematics model is rapidly amortised across successive adaptations.</w:t>
+        <w:t>The training-time column of Table 5.1 highlights the practical advantage of the proposed framework. Adaptation reduces wall-clock training time from 1.873 h to 0.365 h in the 5 DoF case (a reduction of 80.5 %), from 4.973 h to 0.363 h in the 6 DoF case (a reduction of 92.7 %) and from 22.120 h to 0.111 h in the 7 DoF case (a reduction of 99.5 %, a 200× speed-up), while reducing position error below the single-task baseline on all three configurations. These reductions are the most pronounced expression of the meta-kinematics framework's engineering value: when the target configuration is expensive to train from scratch, as the 7 DoF case is, owing to its larger configuration space, the one-off cost of training a shared meta-kinematics model is rapidly amortised across successive adaptations.</w:t>
       </w:r>
       <w:proofErr w:type="spellStart"/>
       <w:proofErr w:type="spellEnd"/>
@@ -19565,92 +19550,20 @@
         <w:rPr>
           <w:color w:val="1A1A1A"/>
         </w:rPr>
-        <w:t xml:space="preserve">To make the </w:t>
+        <w:t>To make the amortised-cost argument precise, it is useful to compare the total cost of supporting all three configurations under both protocols. Under the single-task protocol, training one ResMLP per configuration totals 1.87 + 4.97 + 22.12 = 28.960 hr. Under the meta-kinematics protocol, the shared Stage-2 model is trained once at 1.160 hr and adapted three times at 0.365 + 0.363 + 0.111 = 0.840 hr, for a total of 2.000 hr, a 93.1% reduction in aggregate wall-clock cost (Table 5.2). The shared training cost is amortised across as many adaptations as needed: every additional configuration costs at most one further short adaptation run, so the framework's relative advantage grows with the number of configurations supported.</w:t>
       </w:r>
       <w:proofErr w:type="spellStart"/>
-      <w:r>
-        <w:rPr>
-          <w:color w:val="1A1A1A"/>
-        </w:rPr>
-        <w:t>amortised</w:t>
-      </w:r>
       <w:proofErr w:type="spellEnd"/>
-      <w:r>
-        <w:rPr>
-          <w:color w:val="1A1A1A"/>
-        </w:rPr>
-        <w:t xml:space="preserve">-cost argument precise, it is useful to compare the total cost of supporting all three configurations under both protocols. Under the single-task protocol, training one </w:t>
-      </w:r>
       <w:proofErr w:type="spellStart"/>
-      <w:r>
-        <w:rPr>
-          <w:color w:val="1A1A1A"/>
-        </w:rPr>
-        <w:t>ResMLP</w:t>
-      </w:r>
       <w:proofErr w:type="spellEnd"/>
-      <w:r>
-        <w:rPr>
-          <w:color w:val="1A1A1A"/>
-        </w:rPr>
-        <w:t xml:space="preserve"> per configuration totals 1.87 + 4.97 + 22.12 = 28.96 hr. Under the meta-kinematics protocol, the shared Stage-2 model is trained once at 1.16 </w:t>
-      </w:r>
       <w:proofErr w:type="spellStart"/>
-      <w:r>
-        <w:rPr>
-          <w:color w:val="1A1A1A"/>
-        </w:rPr>
-        <w:t>hr</w:t>
-      </w:r>
       <w:proofErr w:type="spellEnd"/>
-      <w:r>
-        <w:rPr>
-          <w:color w:val="1A1A1A"/>
-        </w:rPr>
-        <w:t xml:space="preserve"> and adapted three times at 0.365 + 0.363 + 0.111 = 0.84 </w:t>
-      </w:r>
       <w:proofErr w:type="spellStart"/>
-      <w:r>
-        <w:rPr>
-          <w:color w:val="1A1A1A"/>
-        </w:rPr>
-        <w:t>hr</w:t>
-      </w:r>
       <w:proofErr w:type="spellEnd"/>
-      <w:r>
-        <w:rPr>
-          <w:color w:val="1A1A1A"/>
-        </w:rPr>
-        <w:t xml:space="preserve">, for a total of 2.00 </w:t>
-      </w:r>
       <w:proofErr w:type="spellStart"/>
-      <w:r>
-        <w:rPr>
-          <w:color w:val="1A1A1A"/>
-        </w:rPr>
-        <w:t>hr</w:t>
-      </w:r>
       <w:proofErr w:type="spellEnd"/>
-      <w:r>
-        <w:rPr>
-          <w:color w:val="1A1A1A"/>
-        </w:rPr>
-        <w:t xml:space="preserve">, a 93.1% reduction in aggregate wall-clock cost (Table 5.2). The shared training cost is </w:t>
-      </w:r>
       <w:proofErr w:type="spellStart"/>
-      <w:r>
-        <w:rPr>
-          <w:color w:val="1A1A1A"/>
-        </w:rPr>
-        <w:t>amortised</w:t>
-      </w:r>
       <w:proofErr w:type="spellEnd"/>
-      <w:r>
-        <w:rPr>
-          <w:color w:val="1A1A1A"/>
-        </w:rPr>
-        <w:t xml:space="preserve"> across as many adaptations as needed: every additional configuration costs at most one further short adaptation run, so the framework's relative advantage grows with the number of configurations supported.</w:t>
-      </w:r>
     </w:p>
     <w:p>
       <w:pPr>
@@ -21935,7 +21848,7 @@
                 <w:sz w:val="20"/>
                 <w:szCs w:val="20"/>
               </w:rPr>
-              <w:t>6.2</w:t>
+              <w:t>6.200</w:t>
             </w:r>
           </w:p>
         </w:tc>
@@ -21967,7 +21880,7 @@
                 <w:sz w:val="20"/>
                 <w:szCs w:val="20"/>
               </w:rPr>
-              <w:t>6.2</w:t>
+              <w:t>6.200</w:t>
             </w:r>
           </w:p>
         </w:tc>
@@ -21999,7 +21912,7 @@
                 <w:sz w:val="20"/>
                 <w:szCs w:val="20"/>
               </w:rPr>
-              <w:t>9.3</w:t>
+              <w:t>9.300</w:t>
             </w:r>
           </w:p>
         </w:tc>
@@ -22083,7 +21996,7 @@
                 <w:sz w:val="20"/>
                 <w:szCs w:val="20"/>
               </w:rPr>
-              <w:t>0.8036</w:t>
+              <w:t>0.804</w:t>
             </w:r>
           </w:p>
         </w:tc>
@@ -22112,7 +22025,7 @@
                 <w:sz w:val="20"/>
                 <w:szCs w:val="20"/>
               </w:rPr>
-              <w:t>0.5506</w:t>
+              <w:t>0.551</w:t>
             </w:r>
           </w:p>
         </w:tc>
@@ -22141,7 +22054,7 @@
                 <w:sz w:val="20"/>
                 <w:szCs w:val="20"/>
               </w:rPr>
-              <w:t>1.2039</w:t>
+              <w:t>1.204</w:t>
             </w:r>
           </w:p>
         </w:tc>
@@ -22430,7 +22343,7 @@
                 <w:sz w:val="20"/>
                 <w:szCs w:val="20"/>
               </w:rPr>
-              <w:t>9.0</w:t>
+              <w:t>9.000</w:t>
             </w:r>
           </w:p>
         </w:tc>
@@ -22462,7 +22375,7 @@
                 <w:sz w:val="20"/>
                 <w:szCs w:val="20"/>
               </w:rPr>
-              <w:t>18.6</w:t>
+              <w:t>18.600</w:t>
             </w:r>
           </w:p>
         </w:tc>
@@ -22494,7 +22407,7 @@
                 <w:sz w:val="20"/>
                 <w:szCs w:val="20"/>
               </w:rPr>
-              <w:t>11.0</w:t>
+              <w:t>11.000</w:t>
             </w:r>
           </w:p>
         </w:tc>
@@ -22578,7 +22491,7 @@
                 <w:sz w:val="20"/>
                 <w:szCs w:val="20"/>
               </w:rPr>
-              <w:t>1.3385</w:t>
+              <w:t>1.339</w:t>
             </w:r>
           </w:p>
         </w:tc>
@@ -22607,7 +22520,7 @@
                 <w:sz w:val="20"/>
                 <w:szCs w:val="20"/>
               </w:rPr>
-              <w:t>1.7328</w:t>
+              <w:t>1.733</w:t>
             </w:r>
           </w:p>
         </w:tc>
@@ -22636,7 +22549,7 @@
                 <w:sz w:val="20"/>
                 <w:szCs w:val="20"/>
               </w:rPr>
-              <w:t>1.7136</w:t>
+              <w:t>1.714</w:t>
             </w:r>
           </w:p>
         </w:tc>
@@ -22925,7 +22838,7 @@
                 <w:sz w:val="20"/>
                 <w:szCs w:val="20"/>
               </w:rPr>
-              <w:t>9.9</w:t>
+              <w:t>9.900</w:t>
             </w:r>
           </w:p>
         </w:tc>
@@ -22957,7 +22870,7 @@
                 <w:sz w:val="20"/>
                 <w:szCs w:val="20"/>
               </w:rPr>
-              <w:t>26.5</w:t>
+              <w:t>26.500</w:t>
             </w:r>
           </w:p>
         </w:tc>
@@ -22989,7 +22902,7 @@
                 <w:sz w:val="20"/>
                 <w:szCs w:val="20"/>
               </w:rPr>
-              <w:t>10.1</w:t>
+              <w:t>10.100</w:t>
             </w:r>
           </w:p>
         </w:tc>
@@ -23073,7 +22986,7 @@
                 <w:sz w:val="20"/>
                 <w:szCs w:val="20"/>
               </w:rPr>
-              <w:t>1.7104</w:t>
+              <w:t>1.710</w:t>
             </w:r>
           </w:p>
         </w:tc>
@@ -23102,7 +23015,7 @@
                 <w:sz w:val="20"/>
                 <w:szCs w:val="20"/>
               </w:rPr>
-              <w:t>4.2800</w:t>
+              <w:t>4.280</w:t>
             </w:r>
           </w:p>
         </w:tc>
@@ -23131,7 +23044,7 @@
                 <w:sz w:val="20"/>
                 <w:szCs w:val="20"/>
               </w:rPr>
-              <w:t>2.0853</w:t>
+              <w:t>2.085</w:t>
             </w:r>
           </w:p>
         </w:tc>
@@ -23318,7 +23231,7 @@
                 <w:sz w:val="20"/>
                 <w:szCs w:val="20"/>
               </w:rPr>
-              <w:t>22.12</w:t>
+              <w:t>22.120</w:t>
             </w:r>
           </w:p>
         </w:tc>
@@ -23339,7 +23252,7 @@
         <w:rPr>
           <w:color w:val="1A1A1A"/>
         </w:rPr>
-        <w:t>The Ablation B results, now populated for all three DoF configurations, reveal a consistent DoF-scaling pattern. For the 5-DoF configuration, random-init adaptation at the matched 0.365 hr budget reaches 6.2 mm / 0.55°, essentially tied with the from-shared mean of 6.2 mm / 0.81° on position and even marginally better on orientation. For 6-DoF the gap opens up substantially: random-init reaches 18.6 mm / 1.73°, more than two times worse than the from-shared 8.9 mm / 1.33° at the same 0.363 hr budget. For 7-DoF, the gap widens further: random-init reaches 26.5 mm / 4.28° at the matched 0.111 hr budget, 2.7 times worse on position and 2.5 times worse on orientation than the from-shared headline of 9.9 mm / 1.72°. This pattern is internally consistent with the data-efficiency curves of Figure 5.7 and ties the two ablations into one finding: the shared meta-kinematics representation is most valuable where it is most needed. For 5-DoF, K = 50 000 support samples cover the (relatively small) configuration space densely enough that even random-init adaptation can recover the per-DoF mapping within the matched wall-clock budget, the shared representation does not provide a competitive advantage in this regime. For 6-DoF and especially 7-DoF, the configuration space is large relative to K = 50 000, the model is in the data-limited regime, and the shared meta-kinematics initialisation provides a structural prior without which the adapter cannot converge inside the matched budget. The wall-clock reductions reported in Table 5.1 (80.5 % for 5-DoF, 92.7 % for 6-DoF and 99.5 % for 7-DoF, all relative to single-task training) are therefore a composite advantage with two distinct contributions: the adaptation protocol itself (mask conditioning, support-set early-stopping) accounts for the 5-DoF saving, while the shared meta-kinematics initialisation is the dominant source of the 6- and 7-DoF savings. Both contributions are necessary; neither alone reproduces the headline pattern across all three configurations.</w:t>
+        <w:t>The Ablation B results, now populated for all three DoF configurations, reveal a consistent DoF-scaling pattern. For the 5-DoF configuration, random-init adaptation at the matched 0.365 hr budget reaches 6.200 mm / 0.550°, essentially tied with the from-shared mean of 6.200 mm / 0.810° on position and even marginally better on orientation. For 6-DoF the gap opens up substantially: random-init reaches 18.600 mm / 1.730°, more than two times worse than the from-shared 8.900 mm / 1.330° at the same 0.363 hr budget. For 7-DoF, the gap widens further: random-init reaches 26.500 mm / 4.280° at the matched 0.111 hr budget, 2.7 times worse on position and 2.5 times worse on orientation than the from-shared headline of 9.900 mm / 1.720°. This pattern is internally consistent with the data-efficiency curves of Figure 5.7 and ties the two ablations into one finding: the shared meta-kinematics representation is most valuable where it is most needed. For 5-DoF, K = 50 000 support samples cover the (relatively small) configuration space densely enough that even random-init adaptation can recover the per-DoF mapping within the matched wall-clock budget, the shared representation does not provide a competitive advantage in this regime. For 6-DoF and especially 7-DoF, the configuration space is large relative to K = 50 000, the model is in the data-limited regime, and the shared meta-kinematics initialisation provides a structural prior without which the adapter cannot converge inside the matched budget. The wall-clock reductions reported in Table 5.1 (80.5 % for 5-DoF, 92.7 % for 6-DoF and 99.5 % for 7-DoF, all relative to single-task training) are therefore a composite advantage with two distinct contributions: the adaptation protocol itself (mask conditioning, support-set early-stopping) accounts for the 5-DoF saving, while the shared meta-kinematics initialisation is the dominant source of the 6- and 7-DoF savings. Both contributions are necessary; neither alone reproduces the headline pattern across all three configurations.</w:t>
       </w:r>
       <w:proofErr w:type="spellStart"/>
       <w:proofErr w:type="spellEnd"/>
@@ -23448,7 +23361,7 @@
         <w:rPr>
           <w:color w:val="1A1A1A"/>
         </w:rPr>
-        <w:t>Table 5.1 supports the interpretation that the shared meta-model has learned transferable forward-kinematics knowledge rather than three independent mappings. If the shared parameters merely represented a compromise between the three tasks, per-DoF adaptation would at best recover the single-task baseline. Instead, adaptation improves over the baseline reproducibly across all three seeds and all three DoF configurations, indicating that fine-tuning exploits a useful prior established during shared training. The 7-DoF case is also where the adaptation delivers its largest wall-clock saving: at 0.111 hr per-DoF, the n = 3 mean (9.901 ± 0.014 mm / 1.722° ± 0.003°) sits below the single-task baseline (10.1 mm / 2.085°) reached only after 22.12 hr of single-task training.</w:t>
+        <w:t>Table 5.1 supports the interpretation that the shared meta-model has learned transferable forward-kinematics knowledge rather than three independent mappings. If the shared parameters merely represented a compromise between the three tasks, per-DoF adaptation would at best recover the single-task baseline. Instead, adaptation improves over the baseline reproducibly across all three seeds and all three DoF configurations, indicating that fine-tuning exploits a useful prior established during shared training. The 7-DoF case is also where the adaptation delivers its largest wall-clock saving: at 0.111 hr per-DoF, the n = 3 mean (9.901 ± 0.014 mm / 1.722° ± 0.003°) sits below the single-task baseline (10.100 mm / 2.085°) reached only after 22.120 hr of single-task training.</w:t>
       </w:r>
       <w:proofErr w:type="spellStart"/>
       <w:proofErr w:type="spellEnd"/>
@@ -23469,7 +23382,7 @@
         <w:rPr>
           <w:color w:val="1A1A1A"/>
         </w:rPr>
-        <w:t>The 7-DoF case is also where the shared model's accuracy is closest to the single-task baseline (10.9 mm versus 10.1 mm), readable as a small price paid for the shared parameterisation. Per-DoF adaptation closes that gap consistently across all three seeds, giving an n = 3 mean of 9.901 ± 0.014 mm, with a 95 % CI of [9.802, 10.001] mm that lies below the single-task baseline. These observations suggest the shared backbone captures the kinematic structure common across configurations, while the per-DoF stage encodes task-specific refinements that the shared parameters cannot represent in full; the ablations of Section 5.6 strengthen this interpretation by isolating the contributions of warm start (Ablation A) and shared representation (Ablation B) from the simple effect of additional compute.</w:t>
+        <w:t>The 7-DoF case is also where the shared model's accuracy is closest to the single-task baseline (10.900 mm versus 10.100 mm), readable as a small price paid for the shared parameterisation. Per-DoF adaptation closes that gap consistently across all three seeds, giving an n = 3 mean of 9.901 ± 0.014 mm, with a 95 % CI of [9.802, 10.001] mm that lies below the single-task baseline. These observations suggest the shared backbone captures the kinematic structure common across configurations, while the per-DoF stage encodes task-specific refinements that the shared parameters cannot represent in full; the ablations of Section 5.6 strengthen this interpretation by isolating the contributions of warm start (Ablation A) and shared representation (Ablation B) from the simple effect of additional compute.</w:t>
       </w:r>
       <w:proofErr w:type="spellStart"/>
       <w:proofErr w:type="spellEnd"/>
@@ -23784,7 +23697,7 @@
         <w:rPr>
           <w:color w:val="1A1A1A"/>
         </w:rPr>
-        <w:t>The most consequential engineering result is the combination of below-baseline accuracy and 200 times wall-clock advantage at 7-DoF: at the matched 0.111 hr per-DoF adaptation budget, the adapted meta-kinematics model reaches a position error of 9.901 ± 0.014 mm (n = 3 mean, 95 % CI [9.802, 10.001] mm), below the single-task baseline of 10.1 mm, while the single-task model requires 22.12 hr to reach equivalent accuracy. The Ablation B results in Section 5.6.2 sharpen this: the 99.5 % saving for 7-DoF is specifically driven by the shared meta-kinematics initialisation; at the matched budget, an otherwise-identical adaptation run from random initialisation reaches only 26.5 mm / 4.28°, well above the headline 9.9 mm / 1.72°. The 80.5 % saving for 5-DoF is, by contrast, largely attributable to the adaptation protocol itself (mask conditioning + early stopping on a small support set), since random-init adaptation matches the from-shared accuracy at the same wall-clock budget. The two contributions of the framework, the cross-DoF shared representation and the per-DoF adaptation protocol, are therefore complementary, with the shared representation becoming progressively more decisive as the active-DoF count grows. In a development workflow that has to support multiple DoF configurations of the same robot, e.g. when distal joints are locked for a constrained task or a joint is intentionally disabled, the framework converts a series of long, independent training jobs into one shared training run followed by a sequence of short adaptations.</w:t>
+        <w:t>The most consequential engineering result is the combination of below-baseline accuracy and 200 times wall-clock advantage at 7-DoF: at the matched 0.111 hr per-DoF adaptation budget, the adapted meta-kinematics model reaches a position error of 9.901 ± 0.014 mm (n = 3 mean, 95 % CI [9.802, 10.001] mm), below the single-task baseline of 10.100 mm, while the single-task model requires 22.120 hr to reach equivalent accuracy. The Ablation B results in Section 5.6.2 sharpen this: the 99.5 % saving for 7-DoF is specifically driven by the shared meta-kinematics initialisation; at the matched budget, an otherwise-identical adaptation run from random initialisation reaches only 26.500 mm / 4.280°, well above the headline 9.900 mm / 1.720°. The 80.5 % saving for 5-DoF is, by contrast, largely attributable to the adaptation protocol itself (mask conditioning + early stopping on a small support set), since random-init adaptation matches the from-shared accuracy at the same wall-clock budget. The two contributions of the framework, the cross-DoF shared representation and the per-DoF adaptation protocol, are therefore complementary, with the shared representation becoming progressively more decisive as the active-DoF count grows. In a development workflow that has to support multiple DoF configurations of the same robot, e.g. when distal joints are locked for a constrained task or a joint is intentionally disabled, the framework converts a series of long, independent training jobs into one shared training run followed by a sequence of short adaptations.</w:t>
       </w:r>
       <w:proofErr w:type="spellStart"/>
       <w:proofErr w:type="spellEnd"/>
@@ -24086,7 +23999,7 @@
         <w:rPr>
           <w:color w:val="1A1A1A"/>
         </w:rPr>
-        <w:t>A fully head-to-head numerical comparison against the SE(3)-aware works on the present forward-kinematics task is non-trivial: each targets a different input modality and output objective (pose-from-pixels, IK rather than FK, or different robots), and porting them to the iiwa 14 cross-DoF setting lies beyond the scope of this submission. The 6.2–9.9 mm mean Euclidean position errors and 0.81–1.72° mean orientation errors achieved by the adapted meta-kinematics models on the iiwa 14 sit within the band of recent learning-based kinematic models on comparable serial manipulators, while additionally supporting transfer across multiple DoF configurations of the same arm, a property that the cited prior works do not attempt to provide. A full apples-to-apples comparison is identified in Section 7.3 as a planned journal extension.</w:t>
+        <w:t>A fully head-to-head numerical comparison against the SE(3)-aware works on the present forward-kinematics task is non-trivial: each targets a different input modality and output objective (pose-from-pixels, IK rather than FK, or different robots), and porting them to the iiwa 14 cross-DoF setting lies beyond the scope of this submission. The 6.200–9.900 mm mean Euclidean position errors and 0.81–1.720° mean orientation errors achieved by the adapted meta-kinematics models on the iiwa 14 sit within the band of recent learning-based kinematic models on comparable serial manipulators, while additionally supporting transfer across multiple DoF configurations of the same arm, a property that the cited prior works do not attempt to provide. A full apples-to-apples comparison is identified in Section 7.3 as a planned journal extension.</w:t>
       </w:r>
       <w:proofErr w:type="spellStart"/>
       <w:proofErr w:type="spellEnd"/>
@@ -24378,7 +24291,7 @@
         <w:rPr>
           <w:color w:val="1A1A1A"/>
         </w:rPr>
-        <w:t>Each of the four project aims set out in Section 1.3 has been addressed. Aim 1 (accurate FK models for 5, 6 and 7 DoF) is delivered in Section 5.1, where the single-task ResMLP baselines achieve position errors below 11.0 mm and orientation errors below 2.1° on held-out test data. Aim 2 (one shared multi-task FK model) is delivered in Section 5.2, where the shared model improves on the single-task baselines in two of three configurations (5- and 6-DoF) and is within 0.8 mm of the baseline on the third (7-DoF). Aim 3 (per-DoF adaptation improves the shared model) is delivered in Sections 5.3 and 5.4: adaptation reduces error below the single-task baseline on all three configurations (n = 3 95 % CI below the baseline; one-sample t-test p &lt; 0.05 on the position metric) at a 200× wall-clock advantage on 7-DoF. Aim 4 (comparing performance across DoF settings) is delivered in Sections 5.4 and 5.5, where position error, orientation error and wall-clock time are reported jointly for all three configurations and all three model variants.</w:t>
+        <w:t>Each of the four project aims set out in Section 1.3 has been addressed. Aim 1 (accurate FK models for 5, 6 and 7 DoF) is delivered in Section 5.1, where the single-task ResMLP baselines achieve position errors below 11.000 mm and orientation errors below 2.100° on held-out test data. Aim 2 (one shared multi-task FK model) is delivered in Section 5.2, where the shared model improves on the single-task baselines in two of three configurations (5- and 6-DoF) and is within 0.800 mm of the baseline on the third (7-DoF). Aim 3 (per-DoF adaptation improves the shared model) is delivered in Sections 5.3 and 5.4: adaptation reduces error below the single-task baseline on all three configurations (n = 3 95 % CI below the baseline; one-sample t-test p &lt; 0.05 on the position metric) at a 200× wall-clock advantage on 7-DoF. Aim 4 (comparing performance across DoF settings) is delivered in Sections 5.4 and 5.5, where position error, orientation error and wall-clock time are reported jointly for all three configurations and all three model variants.</w:t>
       </w:r>
       <w:proofErr w:type="spellStart"/>
       <w:proofErr w:type="spellEnd"/>
@@ -30804,16 +30717,9 @@
                 <w:sz w:val="20"/>
                 <w:szCs w:val="20"/>
               </w:rPr>
-              <w:t>std_floor_q</w:t>
+              <w:t>std_floor_q = 1.000° equivalent. Not used in FK, the work reported here is FK only</w:t>
             </w:r>
             <w:proofErr w:type="spellEnd"/>
-            <w:r>
-              <w:rPr>
-                <w:sz w:val="20"/>
-                <w:szCs w:val="20"/>
-              </w:rPr>
-              <w:t xml:space="preserve"> = 1.0° equivalent. Not used in FK, the work reported here is FK only</w:t>
-            </w:r>
           </w:p>
         </w:tc>
       </w:tr>
@@ -32823,16 +32729,9 @@
                 <w:sz w:val="20"/>
                 <w:szCs w:val="20"/>
               </w:rPr>
-              <w:t xml:space="preserve">22.12 </w:t>
+              <w:t>22.120 hr</w:t>
             </w:r>
             <w:proofErr w:type="spellStart"/>
-            <w:r>
-              <w:rPr>
-                <w:sz w:val="20"/>
-                <w:szCs w:val="20"/>
-              </w:rPr>
-              <w:t>hr</w:t>
-            </w:r>
             <w:proofErr w:type="spellEnd"/>
           </w:p>
         </w:tc>

</xml_diff>